<commit_message>
docs(informe): migrate 13 QA screenshots into Anexo A and fix docx path errors
- Extract 13 evidence screenshots from Andrés's docx into assets/anexo-a-evidencias-qa/
- Rewrite Anexo A placeholder with real captioned images
- Fix simfat-api → simfat-backend and Java 21 → Java 17 in SIMFAT Entrega Final 3.docx
</commit_message>
<xml_diff>
--- a/Documentacion/SIMFAT Entrega Final 3.docx
+++ b/Documentacion/SIMFAT Entrega Final 3.docx
@@ -858,7 +858,7 @@
       </w:r>
       <w:proofErr w:type="spellEnd"/>
       <w:r>
-        <w:t>: Java 21 + Spring Boot 3</w:t>
+        <w:t>: Java 17 + Spring Boot 3</w:t>
       </w:r>
     </w:p>
     <w:p>
@@ -1978,7 +1978,7 @@
           </w:tcPr>
           <w:p>
             <w:r>
-              <w:t>Java 21 + Spring Boot 3</w:t>
+              <w:t>Java 17 + Spring Boot 3</w:t>
             </w:r>
           </w:p>
         </w:tc>
@@ -27084,7 +27084,7 @@
       </w:r>
       <w:proofErr w:type="spellEnd"/>
       <w:r>
-        <w:t>-api &amp;</w:t>
+        <w:t>-backend &amp;</w:t>
       </w:r>
       <w:proofErr w:type="gramStart"/>
       <w:r>
@@ -32567,7 +32567,7 @@
       </w:r>
       <w:proofErr w:type="spellEnd"/>
       <w:r>
-        <w:t>-api/          # API Spring Boot (Java 21)</w:t>
+        <w:t>-backend/      # API Spring Boot (Java 17)</w:t>
       </w:r>
     </w:p>
     <w:p>

</xml_diff>